<commit_message>
auto: sync 2026-08-14 15:33:42
</commit_message>
<xml_diff>
--- a/docs/downloads/Pixous_HR_Requirements_v1.0.docx
+++ b/docs/downloads/Pixous_HR_Requirements_v1.0.docx
@@ -7358,6 +7358,1351 @@
                 <w:sz w:val="18"/>
               </w:rPr>
               <w:t>All</w:t>
+            </w:r>
+          </w:p>
+        </w:tc>
+      </w:tr>
+    </w:tbl>
+    <w:p>
+      <w:pPr>
+        <w:pStyle w:val="Heading3"/>
+      </w:pPr>
+      <w:r>
+        <w:t>FR-21 AI Chatbot &amp; Knowledge Base</w:t>
+      </w:r>
+    </w:p>
+    <w:tbl>
+      <w:tblPr>
+        <w:tblStyle w:val="TableGrid"/>
+        <w:tblW w:type="auto" w:w="0"/>
+        <w:jc w:val="center"/>
+        <w:tblLook w:firstColumn="1" w:firstRow="1" w:lastColumn="0" w:lastRow="0" w:noHBand="0" w:noVBand="1" w:val="04A0"/>
+      </w:tblPr>
+      <w:tblGrid>
+        <w:gridCol w:w="3106"/>
+        <w:gridCol w:w="3106"/>
+        <w:gridCol w:w="3106"/>
+      </w:tblGrid>
+      <w:tr>
+        <w:tc>
+          <w:tcPr>
+            <w:tcW w:type="dxa" w:w="3106"/>
+            <w:shd w:val="clear" w:fill="4F46E5"/>
+          </w:tcPr>
+          <w:p>
+            <w:r>
+              <w:rPr>
+                <w:b/>
+                <w:color w:val="FFFFFF"/>
+                <w:sz w:val="19"/>
+              </w:rPr>
+              <w:t>ID</w:t>
+            </w:r>
+          </w:p>
+        </w:tc>
+        <w:tc>
+          <w:tcPr>
+            <w:tcW w:type="dxa" w:w="3106"/>
+            <w:shd w:val="clear" w:fill="4F46E5"/>
+          </w:tcPr>
+          <w:p>
+            <w:r>
+              <w:rPr>
+                <w:b/>
+                <w:color w:val="FFFFFF"/>
+                <w:sz w:val="19"/>
+              </w:rPr>
+              <w:t>Requirement</w:t>
+            </w:r>
+          </w:p>
+        </w:tc>
+        <w:tc>
+          <w:tcPr>
+            <w:tcW w:type="dxa" w:w="3106"/>
+            <w:shd w:val="clear" w:fill="4F46E5"/>
+          </w:tcPr>
+          <w:p>
+            <w:r>
+              <w:rPr>
+                <w:b/>
+                <w:color w:val="FFFFFF"/>
+                <w:sz w:val="19"/>
+              </w:rPr>
+              <w:t>Actor</w:t>
+            </w:r>
+          </w:p>
+        </w:tc>
+      </w:tr>
+      <w:tr>
+        <w:tc>
+          <w:tcPr>
+            <w:tcW w:type="dxa" w:w="3106"/>
+          </w:tcPr>
+          <w:p>
+            <w:r>
+              <w:rPr>
+                <w:sz w:val="18"/>
+              </w:rPr>
+              <w:t>FR-21.1</w:t>
+            </w:r>
+          </w:p>
+        </w:tc>
+        <w:tc>
+          <w:tcPr>
+            <w:tcW w:type="dxa" w:w="3106"/>
+          </w:tcPr>
+          <w:p>
+            <w:r>
+              <w:rPr>
+                <w:sz w:val="18"/>
+              </w:rPr>
+              <w:t>Employees can ask the assistant questions (leave policy, payroll, attendance) in the UI</w:t>
+            </w:r>
+          </w:p>
+        </w:tc>
+        <w:tc>
+          <w:tcPr>
+            <w:tcW w:type="dxa" w:w="3106"/>
+          </w:tcPr>
+          <w:p>
+            <w:r>
+              <w:rPr>
+                <w:sz w:val="18"/>
+              </w:rPr>
+              <w:t>All</w:t>
+            </w:r>
+          </w:p>
+        </w:tc>
+      </w:tr>
+      <w:tr>
+        <w:tc>
+          <w:tcPr>
+            <w:tcW w:type="dxa" w:w="3106"/>
+          </w:tcPr>
+          <w:p>
+            <w:r>
+              <w:rPr>
+                <w:sz w:val="18"/>
+              </w:rPr>
+              <w:t>FR-21.2</w:t>
+            </w:r>
+          </w:p>
+        </w:tc>
+        <w:tc>
+          <w:tcPr>
+            <w:tcW w:type="dxa" w:w="3106"/>
+          </w:tcPr>
+          <w:p>
+            <w:r>
+              <w:rPr>
+                <w:sz w:val="18"/>
+              </w:rPr>
+              <w:t>Answers are grounded in the company knowledge base and org context (</w:t>
+            </w:r>
+            <w:r>
+              <w:rPr>
+                <w:rFonts w:ascii="Consolas" w:hAnsi="Consolas"/>
+                <w:color w:val="4F46E5"/>
+                <w:sz w:val="19"/>
+              </w:rPr>
+              <w:t>ChatbotKnowledge</w:t>
+            </w:r>
+            <w:r>
+              <w:rPr>
+                <w:sz w:val="18"/>
+              </w:rPr>
+              <w:t xml:space="preserve">, </w:t>
+            </w:r>
+            <w:r>
+              <w:rPr>
+                <w:rFonts w:ascii="Consolas" w:hAnsi="Consolas"/>
+                <w:color w:val="4F46E5"/>
+                <w:sz w:val="19"/>
+              </w:rPr>
+              <w:t>ChatbotOrgContext</w:t>
+            </w:r>
+            <w:r>
+              <w:rPr>
+                <w:sz w:val="18"/>
+              </w:rPr>
+              <w:t>)</w:t>
+            </w:r>
+          </w:p>
+        </w:tc>
+        <w:tc>
+          <w:tcPr>
+            <w:tcW w:type="dxa" w:w="3106"/>
+          </w:tcPr>
+          <w:p>
+            <w:r>
+              <w:rPr>
+                <w:sz w:val="18"/>
+              </w:rPr>
+              <w:t>All</w:t>
+            </w:r>
+          </w:p>
+        </w:tc>
+      </w:tr>
+      <w:tr>
+        <w:tc>
+          <w:tcPr>
+            <w:tcW w:type="dxa" w:w="3106"/>
+          </w:tcPr>
+          <w:p>
+            <w:r>
+              <w:rPr>
+                <w:sz w:val="18"/>
+              </w:rPr>
+              <w:t>FR-21.3</w:t>
+            </w:r>
+          </w:p>
+        </w:tc>
+        <w:tc>
+          <w:tcPr>
+            <w:tcW w:type="dxa" w:w="3106"/>
+          </w:tcPr>
+          <w:p>
+            <w:r>
+              <w:rPr>
+                <w:sz w:val="18"/>
+              </w:rPr>
+              <w:t>Unanswerable queries return a graceful fallback message, never an exception</w:t>
+            </w:r>
+          </w:p>
+        </w:tc>
+        <w:tc>
+          <w:tcPr>
+            <w:tcW w:type="dxa" w:w="3106"/>
+          </w:tcPr>
+          <w:p>
+            <w:r>
+              <w:rPr>
+                <w:sz w:val="18"/>
+              </w:rPr>
+              <w:t>All</w:t>
+            </w:r>
+          </w:p>
+        </w:tc>
+      </w:tr>
+    </w:tbl>
+    <w:p>
+      <w:pPr>
+        <w:pStyle w:val="Heading3"/>
+      </w:pPr>
+      <w:r>
+        <w:t>FR-22 Community, Calls &amp; Presence</w:t>
+      </w:r>
+    </w:p>
+    <w:tbl>
+      <w:tblPr>
+        <w:tblStyle w:val="TableGrid"/>
+        <w:tblW w:type="auto" w:w="0"/>
+        <w:jc w:val="center"/>
+        <w:tblLook w:firstColumn="1" w:firstRow="1" w:lastColumn="0" w:lastRow="0" w:noHBand="0" w:noVBand="1" w:val="04A0"/>
+      </w:tblPr>
+      <w:tblGrid>
+        <w:gridCol w:w="3106"/>
+        <w:gridCol w:w="3106"/>
+        <w:gridCol w:w="3106"/>
+      </w:tblGrid>
+      <w:tr>
+        <w:tc>
+          <w:tcPr>
+            <w:tcW w:type="dxa" w:w="3106"/>
+            <w:shd w:val="clear" w:fill="4F46E5"/>
+          </w:tcPr>
+          <w:p>
+            <w:r>
+              <w:rPr>
+                <w:b/>
+                <w:color w:val="FFFFFF"/>
+                <w:sz w:val="19"/>
+              </w:rPr>
+              <w:t>ID</w:t>
+            </w:r>
+          </w:p>
+        </w:tc>
+        <w:tc>
+          <w:tcPr>
+            <w:tcW w:type="dxa" w:w="3106"/>
+            <w:shd w:val="clear" w:fill="4F46E5"/>
+          </w:tcPr>
+          <w:p>
+            <w:r>
+              <w:rPr>
+                <w:b/>
+                <w:color w:val="FFFFFF"/>
+                <w:sz w:val="19"/>
+              </w:rPr>
+              <w:t>Requirement</w:t>
+            </w:r>
+          </w:p>
+        </w:tc>
+        <w:tc>
+          <w:tcPr>
+            <w:tcW w:type="dxa" w:w="3106"/>
+            <w:shd w:val="clear" w:fill="4F46E5"/>
+          </w:tcPr>
+          <w:p>
+            <w:r>
+              <w:rPr>
+                <w:b/>
+                <w:color w:val="FFFFFF"/>
+                <w:sz w:val="19"/>
+              </w:rPr>
+              <w:t>Actor</w:t>
+            </w:r>
+          </w:p>
+        </w:tc>
+      </w:tr>
+      <w:tr>
+        <w:tc>
+          <w:tcPr>
+            <w:tcW w:type="dxa" w:w="3106"/>
+          </w:tcPr>
+          <w:p>
+            <w:r>
+              <w:rPr>
+                <w:sz w:val="18"/>
+              </w:rPr>
+              <w:t>FR-22.1</w:t>
+            </w:r>
+          </w:p>
+        </w:tc>
+        <w:tc>
+          <w:tcPr>
+            <w:tcW w:type="dxa" w:w="3106"/>
+          </w:tcPr>
+          <w:p>
+            <w:r>
+              <w:rPr>
+                <w:sz w:val="18"/>
+              </w:rPr>
+              <w:t>Employees can post to the community feed and interact with posts</w:t>
+            </w:r>
+          </w:p>
+        </w:tc>
+        <w:tc>
+          <w:tcPr>
+            <w:tcW w:type="dxa" w:w="3106"/>
+          </w:tcPr>
+          <w:p>
+            <w:r>
+              <w:rPr>
+                <w:sz w:val="18"/>
+              </w:rPr>
+              <w:t>All</w:t>
+            </w:r>
+          </w:p>
+        </w:tc>
+      </w:tr>
+      <w:tr>
+        <w:tc>
+          <w:tcPr>
+            <w:tcW w:type="dxa" w:w="3106"/>
+          </w:tcPr>
+          <w:p>
+            <w:r>
+              <w:rPr>
+                <w:sz w:val="18"/>
+              </w:rPr>
+              <w:t>FR-22.2</w:t>
+            </w:r>
+          </w:p>
+        </w:tc>
+        <w:tc>
+          <w:tcPr>
+            <w:tcW w:type="dxa" w:w="3106"/>
+          </w:tcPr>
+          <w:p>
+            <w:r>
+              <w:rPr>
+                <w:sz w:val="18"/>
+              </w:rPr>
+              <w:t>Voice/video call initiation between employees with presence awareness</w:t>
+            </w:r>
+          </w:p>
+        </w:tc>
+        <w:tc>
+          <w:tcPr>
+            <w:tcW w:type="dxa" w:w="3106"/>
+          </w:tcPr>
+          <w:p>
+            <w:r>
+              <w:rPr>
+                <w:sz w:val="18"/>
+              </w:rPr>
+              <w:t>All</w:t>
+            </w:r>
+          </w:p>
+        </w:tc>
+      </w:tr>
+      <w:tr>
+        <w:tc>
+          <w:tcPr>
+            <w:tcW w:type="dxa" w:w="3106"/>
+          </w:tcPr>
+          <w:p>
+            <w:r>
+              <w:rPr>
+                <w:sz w:val="18"/>
+              </w:rPr>
+              <w:t>FR-22.3</w:t>
+            </w:r>
+          </w:p>
+        </w:tc>
+        <w:tc>
+          <w:tcPr>
+            <w:tcW w:type="dxa" w:w="3106"/>
+          </w:tcPr>
+          <w:p>
+            <w:r>
+              <w:rPr>
+                <w:sz w:val="18"/>
+              </w:rPr>
+              <w:t>Presence (online/away/offline) is broadcast in real time via event listeners and shown across the UI</w:t>
+            </w:r>
+          </w:p>
+        </w:tc>
+        <w:tc>
+          <w:tcPr>
+            <w:tcW w:type="dxa" w:w="3106"/>
+          </w:tcPr>
+          <w:p>
+            <w:r>
+              <w:rPr>
+                <w:sz w:val="18"/>
+              </w:rPr>
+              <w:t>All</w:t>
+            </w:r>
+          </w:p>
+        </w:tc>
+      </w:tr>
+      <w:tr>
+        <w:tc>
+          <w:tcPr>
+            <w:tcW w:type="dxa" w:w="3106"/>
+          </w:tcPr>
+          <w:p>
+            <w:r>
+              <w:rPr>
+                <w:sz w:val="18"/>
+              </w:rPr>
+              <w:t>FR-22.4</w:t>
+            </w:r>
+          </w:p>
+        </w:tc>
+        <w:tc>
+          <w:tcPr>
+            <w:tcW w:type="dxa" w:w="3106"/>
+          </w:tcPr>
+          <w:p>
+            <w:r>
+              <w:rPr>
+                <w:sz w:val="18"/>
+              </w:rPr>
+              <w:t>Chat events are produced/consumed asynchronously (Kafka-style event bus) without blocking the UI</w:t>
+            </w:r>
+          </w:p>
+        </w:tc>
+        <w:tc>
+          <w:tcPr>
+            <w:tcW w:type="dxa" w:w="3106"/>
+          </w:tcPr>
+          <w:p>
+            <w:r>
+              <w:rPr>
+                <w:sz w:val="18"/>
+              </w:rPr>
+              <w:t>All</w:t>
+            </w:r>
+          </w:p>
+        </w:tc>
+      </w:tr>
+    </w:tbl>
+    <w:p>
+      <w:pPr>
+        <w:pStyle w:val="Heading3"/>
+      </w:pPr>
+      <w:r>
+        <w:t>FR-23 Performance Management</w:t>
+      </w:r>
+    </w:p>
+    <w:tbl>
+      <w:tblPr>
+        <w:tblStyle w:val="TableGrid"/>
+        <w:tblW w:type="auto" w:w="0"/>
+        <w:jc w:val="center"/>
+        <w:tblLook w:firstColumn="1" w:firstRow="1" w:lastColumn="0" w:lastRow="0" w:noHBand="0" w:noVBand="1" w:val="04A0"/>
+      </w:tblPr>
+      <w:tblGrid>
+        <w:gridCol w:w="3106"/>
+        <w:gridCol w:w="3106"/>
+        <w:gridCol w:w="3106"/>
+      </w:tblGrid>
+      <w:tr>
+        <w:tc>
+          <w:tcPr>
+            <w:tcW w:type="dxa" w:w="3106"/>
+            <w:shd w:val="clear" w:fill="4F46E5"/>
+          </w:tcPr>
+          <w:p>
+            <w:r>
+              <w:rPr>
+                <w:b/>
+                <w:color w:val="FFFFFF"/>
+                <w:sz w:val="19"/>
+              </w:rPr>
+              <w:t>ID</w:t>
+            </w:r>
+          </w:p>
+        </w:tc>
+        <w:tc>
+          <w:tcPr>
+            <w:tcW w:type="dxa" w:w="3106"/>
+            <w:shd w:val="clear" w:fill="4F46E5"/>
+          </w:tcPr>
+          <w:p>
+            <w:r>
+              <w:rPr>
+                <w:b/>
+                <w:color w:val="FFFFFF"/>
+                <w:sz w:val="19"/>
+              </w:rPr>
+              <w:t>Requirement</w:t>
+            </w:r>
+          </w:p>
+        </w:tc>
+        <w:tc>
+          <w:tcPr>
+            <w:tcW w:type="dxa" w:w="3106"/>
+            <w:shd w:val="clear" w:fill="4F46E5"/>
+          </w:tcPr>
+          <w:p>
+            <w:r>
+              <w:rPr>
+                <w:b/>
+                <w:color w:val="FFFFFF"/>
+                <w:sz w:val="19"/>
+              </w:rPr>
+              <w:t>Actor</w:t>
+            </w:r>
+          </w:p>
+        </w:tc>
+      </w:tr>
+      <w:tr>
+        <w:tc>
+          <w:tcPr>
+            <w:tcW w:type="dxa" w:w="3106"/>
+          </w:tcPr>
+          <w:p>
+            <w:r>
+              <w:rPr>
+                <w:sz w:val="18"/>
+              </w:rPr>
+              <w:t>FR-23.1</w:t>
+            </w:r>
+          </w:p>
+        </w:tc>
+        <w:tc>
+          <w:tcPr>
+            <w:tcW w:type="dxa" w:w="3106"/>
+          </w:tcPr>
+          <w:p>
+            <w:r>
+              <w:rPr>
+                <w:sz w:val="18"/>
+              </w:rPr>
+              <w:t>HR/TL can define performance goals for employees (</w:t>
+            </w:r>
+            <w:r>
+              <w:rPr>
+                <w:rFonts w:ascii="Consolas" w:hAnsi="Consolas"/>
+                <w:color w:val="4F46E5"/>
+                <w:sz w:val="19"/>
+              </w:rPr>
+              <w:t>PerformanceGoal</w:t>
+            </w:r>
+            <w:r>
+              <w:rPr>
+                <w:sz w:val="18"/>
+              </w:rPr>
+              <w:t>)</w:t>
+            </w:r>
+          </w:p>
+        </w:tc>
+        <w:tc>
+          <w:tcPr>
+            <w:tcW w:type="dxa" w:w="3106"/>
+          </w:tcPr>
+          <w:p>
+            <w:r>
+              <w:rPr>
+                <w:sz w:val="18"/>
+              </w:rPr>
+              <w:t>HR, TL</w:t>
+            </w:r>
+          </w:p>
+        </w:tc>
+      </w:tr>
+      <w:tr>
+        <w:tc>
+          <w:tcPr>
+            <w:tcW w:type="dxa" w:w="3106"/>
+          </w:tcPr>
+          <w:p>
+            <w:r>
+              <w:rPr>
+                <w:sz w:val="18"/>
+              </w:rPr>
+              <w:t>FR-23.2</w:t>
+            </w:r>
+          </w:p>
+        </w:tc>
+        <w:tc>
+          <w:tcPr>
+            <w:tcW w:type="dxa" w:w="3106"/>
+          </w:tcPr>
+          <w:p>
+            <w:r>
+              <w:rPr>
+                <w:sz w:val="18"/>
+              </w:rPr>
+              <w:t>HR can create performance reviews with ratings and comments (</w:t>
+            </w:r>
+            <w:r>
+              <w:rPr>
+                <w:rFonts w:ascii="Consolas" w:hAnsi="Consolas"/>
+                <w:color w:val="4F46E5"/>
+                <w:sz w:val="19"/>
+              </w:rPr>
+              <w:t>PerformanceReview</w:t>
+            </w:r>
+            <w:r>
+              <w:rPr>
+                <w:sz w:val="18"/>
+              </w:rPr>
+              <w:t>)</w:t>
+            </w:r>
+          </w:p>
+        </w:tc>
+        <w:tc>
+          <w:tcPr>
+            <w:tcW w:type="dxa" w:w="3106"/>
+          </w:tcPr>
+          <w:p>
+            <w:r>
+              <w:rPr>
+                <w:sz w:val="18"/>
+              </w:rPr>
+              <w:t>HR</w:t>
+            </w:r>
+          </w:p>
+        </w:tc>
+      </w:tr>
+      <w:tr>
+        <w:tc>
+          <w:tcPr>
+            <w:tcW w:type="dxa" w:w="3106"/>
+          </w:tcPr>
+          <w:p>
+            <w:r>
+              <w:rPr>
+                <w:sz w:val="18"/>
+              </w:rPr>
+              <w:t>FR-23.3</w:t>
+            </w:r>
+          </w:p>
+        </w:tc>
+        <w:tc>
+          <w:tcPr>
+            <w:tcW w:type="dxa" w:w="3106"/>
+          </w:tcPr>
+          <w:p>
+            <w:r>
+              <w:rPr>
+                <w:sz w:val="18"/>
+              </w:rPr>
+              <w:t>Employees can view their goals and review history</w:t>
+            </w:r>
+          </w:p>
+        </w:tc>
+        <w:tc>
+          <w:tcPr>
+            <w:tcW w:type="dxa" w:w="3106"/>
+          </w:tcPr>
+          <w:p>
+            <w:r>
+              <w:rPr>
+                <w:sz w:val="18"/>
+              </w:rPr>
+              <w:t>EMP</w:t>
+            </w:r>
+          </w:p>
+        </w:tc>
+      </w:tr>
+    </w:tbl>
+    <w:p>
+      <w:pPr>
+        <w:pStyle w:val="Heading3"/>
+      </w:pPr>
+      <w:r>
+        <w:t>FR-24 Tasks &amp; Task Chat</w:t>
+      </w:r>
+    </w:p>
+    <w:tbl>
+      <w:tblPr>
+        <w:tblStyle w:val="TableGrid"/>
+        <w:tblW w:type="auto" w:w="0"/>
+        <w:jc w:val="center"/>
+        <w:tblLook w:firstColumn="1" w:firstRow="1" w:lastColumn="0" w:lastRow="0" w:noHBand="0" w:noVBand="1" w:val="04A0"/>
+      </w:tblPr>
+      <w:tblGrid>
+        <w:gridCol w:w="3106"/>
+        <w:gridCol w:w="3106"/>
+        <w:gridCol w:w="3106"/>
+      </w:tblGrid>
+      <w:tr>
+        <w:tc>
+          <w:tcPr>
+            <w:tcW w:type="dxa" w:w="3106"/>
+            <w:shd w:val="clear" w:fill="4F46E5"/>
+          </w:tcPr>
+          <w:p>
+            <w:r>
+              <w:rPr>
+                <w:b/>
+                <w:color w:val="FFFFFF"/>
+                <w:sz w:val="19"/>
+              </w:rPr>
+              <w:t>ID</w:t>
+            </w:r>
+          </w:p>
+        </w:tc>
+        <w:tc>
+          <w:tcPr>
+            <w:tcW w:type="dxa" w:w="3106"/>
+            <w:shd w:val="clear" w:fill="4F46E5"/>
+          </w:tcPr>
+          <w:p>
+            <w:r>
+              <w:rPr>
+                <w:b/>
+                <w:color w:val="FFFFFF"/>
+                <w:sz w:val="19"/>
+              </w:rPr>
+              <w:t>Requirement</w:t>
+            </w:r>
+          </w:p>
+        </w:tc>
+        <w:tc>
+          <w:tcPr>
+            <w:tcW w:type="dxa" w:w="3106"/>
+            <w:shd w:val="clear" w:fill="4F46E5"/>
+          </w:tcPr>
+          <w:p>
+            <w:r>
+              <w:rPr>
+                <w:b/>
+                <w:color w:val="FFFFFF"/>
+                <w:sz w:val="19"/>
+              </w:rPr>
+              <w:t>Actor</w:t>
+            </w:r>
+          </w:p>
+        </w:tc>
+      </w:tr>
+      <w:tr>
+        <w:tc>
+          <w:tcPr>
+            <w:tcW w:type="dxa" w:w="3106"/>
+          </w:tcPr>
+          <w:p>
+            <w:r>
+              <w:rPr>
+                <w:sz w:val="18"/>
+              </w:rPr>
+              <w:t>FR-24.1</w:t>
+            </w:r>
+          </w:p>
+        </w:tc>
+        <w:tc>
+          <w:tcPr>
+            <w:tcW w:type="dxa" w:w="3106"/>
+          </w:tcPr>
+          <w:p>
+            <w:r>
+              <w:rPr>
+                <w:sz w:val="18"/>
+              </w:rPr>
+              <w:t>TL/HR can assign tasks to employees with status tracking (</w:t>
+            </w:r>
+            <w:r>
+              <w:rPr>
+                <w:rFonts w:ascii="Consolas" w:hAnsi="Consolas"/>
+                <w:color w:val="4F46E5"/>
+                <w:sz w:val="19"/>
+              </w:rPr>
+              <w:t>Task</w:t>
+            </w:r>
+            <w:r>
+              <w:rPr>
+                <w:sz w:val="18"/>
+              </w:rPr>
+              <w:t>)</w:t>
+            </w:r>
+          </w:p>
+        </w:tc>
+        <w:tc>
+          <w:tcPr>
+            <w:tcW w:type="dxa" w:w="3106"/>
+          </w:tcPr>
+          <w:p>
+            <w:r>
+              <w:rPr>
+                <w:sz w:val="18"/>
+              </w:rPr>
+              <w:t>TL, HR</w:t>
+            </w:r>
+          </w:p>
+        </w:tc>
+      </w:tr>
+      <w:tr>
+        <w:tc>
+          <w:tcPr>
+            <w:tcW w:type="dxa" w:w="3106"/>
+          </w:tcPr>
+          <w:p>
+            <w:r>
+              <w:rPr>
+                <w:sz w:val="18"/>
+              </w:rPr>
+              <w:t>FR-24.2</w:t>
+            </w:r>
+          </w:p>
+        </w:tc>
+        <w:tc>
+          <w:tcPr>
+            <w:tcW w:type="dxa" w:w="3106"/>
+          </w:tcPr>
+          <w:p>
+            <w:r>
+              <w:rPr>
+                <w:sz w:val="18"/>
+              </w:rPr>
+              <w:t>Each task has a threaded chat for collaboration (</w:t>
+            </w:r>
+            <w:r>
+              <w:rPr>
+                <w:rFonts w:ascii="Consolas" w:hAnsi="Consolas"/>
+                <w:color w:val="4F46E5"/>
+                <w:sz w:val="19"/>
+              </w:rPr>
+              <w:t>TaskMessage</w:t>
+            </w:r>
+            <w:r>
+              <w:rPr>
+                <w:sz w:val="18"/>
+              </w:rPr>
+              <w:t>)</w:t>
+            </w:r>
+          </w:p>
+        </w:tc>
+        <w:tc>
+          <w:tcPr>
+            <w:tcW w:type="dxa" w:w="3106"/>
+          </w:tcPr>
+          <w:p>
+            <w:r>
+              <w:rPr>
+                <w:sz w:val="18"/>
+              </w:rPr>
+              <w:t>All</w:t>
+            </w:r>
+          </w:p>
+        </w:tc>
+      </w:tr>
+      <w:tr>
+        <w:tc>
+          <w:tcPr>
+            <w:tcW w:type="dxa" w:w="3106"/>
+          </w:tcPr>
+          <w:p>
+            <w:r>
+              <w:rPr>
+                <w:sz w:val="18"/>
+              </w:rPr>
+              <w:t>FR-24.3</w:t>
+            </w:r>
+          </w:p>
+        </w:tc>
+        <w:tc>
+          <w:tcPr>
+            <w:tcW w:type="dxa" w:w="3106"/>
+          </w:tcPr>
+          <w:p>
+            <w:r>
+              <w:rPr>
+                <w:sz w:val="18"/>
+              </w:rPr>
+              <w:t>Task chat messages are persisted and real-time via the event bus</w:t>
+            </w:r>
+          </w:p>
+        </w:tc>
+        <w:tc>
+          <w:tcPr>
+            <w:tcW w:type="dxa" w:w="3106"/>
+          </w:tcPr>
+          <w:p>
+            <w:r>
+              <w:rPr>
+                <w:sz w:val="18"/>
+              </w:rPr>
+              <w:t>All</w:t>
+            </w:r>
+          </w:p>
+        </w:tc>
+      </w:tr>
+    </w:tbl>
+    <w:p>
+      <w:pPr>
+        <w:pStyle w:val="Heading3"/>
+      </w:pPr>
+      <w:r>
+        <w:t>FR-25 Work Reports &amp; Reminders</w:t>
+      </w:r>
+    </w:p>
+    <w:tbl>
+      <w:tblPr>
+        <w:tblStyle w:val="TableGrid"/>
+        <w:tblW w:type="auto" w:w="0"/>
+        <w:jc w:val="center"/>
+        <w:tblLook w:firstColumn="1" w:firstRow="1" w:lastColumn="0" w:lastRow="0" w:noHBand="0" w:noVBand="1" w:val="04A0"/>
+      </w:tblPr>
+      <w:tblGrid>
+        <w:gridCol w:w="3106"/>
+        <w:gridCol w:w="3106"/>
+        <w:gridCol w:w="3106"/>
+      </w:tblGrid>
+      <w:tr>
+        <w:tc>
+          <w:tcPr>
+            <w:tcW w:type="dxa" w:w="3106"/>
+            <w:shd w:val="clear" w:fill="4F46E5"/>
+          </w:tcPr>
+          <w:p>
+            <w:r>
+              <w:rPr>
+                <w:b/>
+                <w:color w:val="FFFFFF"/>
+                <w:sz w:val="19"/>
+              </w:rPr>
+              <w:t>ID</w:t>
+            </w:r>
+          </w:p>
+        </w:tc>
+        <w:tc>
+          <w:tcPr>
+            <w:tcW w:type="dxa" w:w="3106"/>
+            <w:shd w:val="clear" w:fill="4F46E5"/>
+          </w:tcPr>
+          <w:p>
+            <w:r>
+              <w:rPr>
+                <w:b/>
+                <w:color w:val="FFFFFF"/>
+                <w:sz w:val="19"/>
+              </w:rPr>
+              <w:t>Requirement</w:t>
+            </w:r>
+          </w:p>
+        </w:tc>
+        <w:tc>
+          <w:tcPr>
+            <w:tcW w:type="dxa" w:w="3106"/>
+            <w:shd w:val="clear" w:fill="4F46E5"/>
+          </w:tcPr>
+          <w:p>
+            <w:r>
+              <w:rPr>
+                <w:b/>
+                <w:color w:val="FFFFFF"/>
+                <w:sz w:val="19"/>
+              </w:rPr>
+              <w:t>Actor</w:t>
+            </w:r>
+          </w:p>
+        </w:tc>
+      </w:tr>
+      <w:tr>
+        <w:tc>
+          <w:tcPr>
+            <w:tcW w:type="dxa" w:w="3106"/>
+          </w:tcPr>
+          <w:p>
+            <w:r>
+              <w:rPr>
+                <w:sz w:val="18"/>
+              </w:rPr>
+              <w:t>FR-25.1</w:t>
+            </w:r>
+          </w:p>
+        </w:tc>
+        <w:tc>
+          <w:tcPr>
+            <w:tcW w:type="dxa" w:w="3106"/>
+          </w:tcPr>
+          <w:p>
+            <w:r>
+              <w:rPr>
+                <w:sz w:val="18"/>
+              </w:rPr>
+              <w:t>Employees submit daily work reports with text and optional files</w:t>
+            </w:r>
+          </w:p>
+        </w:tc>
+        <w:tc>
+          <w:tcPr>
+            <w:tcW w:type="dxa" w:w="3106"/>
+          </w:tcPr>
+          <w:p>
+            <w:r>
+              <w:rPr>
+                <w:sz w:val="18"/>
+              </w:rPr>
+              <w:t>EMP</w:t>
+            </w:r>
+          </w:p>
+        </w:tc>
+      </w:tr>
+      <w:tr>
+        <w:tc>
+          <w:tcPr>
+            <w:tcW w:type="dxa" w:w="3106"/>
+          </w:tcPr>
+          <w:p>
+            <w:r>
+              <w:rPr>
+                <w:sz w:val="18"/>
+              </w:rPr>
+              <w:t>FR-25.2</w:t>
+            </w:r>
+          </w:p>
+        </w:tc>
+        <w:tc>
+          <w:tcPr>
+            <w:tcW w:type="dxa" w:w="3106"/>
+          </w:tcPr>
+          <w:p>
+            <w:r>
+              <w:rPr>
+                <w:sz w:val="18"/>
+              </w:rPr>
+              <w:t>TL/HR can review submitted reports (</w:t>
+            </w:r>
+            <w:r>
+              <w:rPr>
+                <w:rFonts w:ascii="Consolas" w:hAnsi="Consolas"/>
+                <w:color w:val="4F46E5"/>
+                <w:sz w:val="19"/>
+              </w:rPr>
+              <w:t>WorkReport</w:t>
+            </w:r>
+            <w:r>
+              <w:rPr>
+                <w:sz w:val="18"/>
+              </w:rPr>
+              <w:t>)</w:t>
+            </w:r>
+          </w:p>
+        </w:tc>
+        <w:tc>
+          <w:tcPr>
+            <w:tcW w:type="dxa" w:w="3106"/>
+          </w:tcPr>
+          <w:p>
+            <w:r>
+              <w:rPr>
+                <w:sz w:val="18"/>
+              </w:rPr>
+              <w:t>TL, HR</w:t>
+            </w:r>
+          </w:p>
+        </w:tc>
+      </w:tr>
+      <w:tr>
+        <w:tc>
+          <w:tcPr>
+            <w:tcW w:type="dxa" w:w="3106"/>
+          </w:tcPr>
+          <w:p>
+            <w:r>
+              <w:rPr>
+                <w:sz w:val="18"/>
+              </w:rPr>
+              <w:t>FR-25.3</w:t>
+            </w:r>
+          </w:p>
+        </w:tc>
+        <w:tc>
+          <w:tcPr>
+            <w:tcW w:type="dxa" w:w="3106"/>
+          </w:tcPr>
+          <w:p>
+            <w:r>
+              <w:rPr>
+                <w:sz w:val="18"/>
+              </w:rPr>
+              <w:t>The reminder service nudges employees who have not submitted by the deadline</w:t>
+            </w:r>
+          </w:p>
+        </w:tc>
+        <w:tc>
+          <w:tcPr>
+            <w:tcW w:type="dxa" w:w="3106"/>
+          </w:tcPr>
+          <w:p>
+            <w:r>
+              <w:rPr>
+                <w:sz w:val="18"/>
+              </w:rPr>
+              <w:t>EMP</w:t>
+            </w:r>
+          </w:p>
+        </w:tc>
+      </w:tr>
+    </w:tbl>
+    <w:p>
+      <w:pPr>
+        <w:pStyle w:val="Heading3"/>
+      </w:pPr>
+      <w:r>
+        <w:t>FR-26 Module Management &amp; Cache (Technical Admin)</w:t>
+      </w:r>
+    </w:p>
+    <w:tbl>
+      <w:tblPr>
+        <w:tblStyle w:val="TableGrid"/>
+        <w:tblW w:type="auto" w:w="0"/>
+        <w:jc w:val="center"/>
+        <w:tblLook w:firstColumn="1" w:firstRow="1" w:lastColumn="0" w:lastRow="0" w:noHBand="0" w:noVBand="1" w:val="04A0"/>
+      </w:tblPr>
+      <w:tblGrid>
+        <w:gridCol w:w="3106"/>
+        <w:gridCol w:w="3106"/>
+        <w:gridCol w:w="3106"/>
+      </w:tblGrid>
+      <w:tr>
+        <w:tc>
+          <w:tcPr>
+            <w:tcW w:type="dxa" w:w="3106"/>
+            <w:shd w:val="clear" w:fill="4F46E5"/>
+          </w:tcPr>
+          <w:p>
+            <w:r>
+              <w:rPr>
+                <w:b/>
+                <w:color w:val="FFFFFF"/>
+                <w:sz w:val="19"/>
+              </w:rPr>
+              <w:t>ID</w:t>
+            </w:r>
+          </w:p>
+        </w:tc>
+        <w:tc>
+          <w:tcPr>
+            <w:tcW w:type="dxa" w:w="3106"/>
+            <w:shd w:val="clear" w:fill="4F46E5"/>
+          </w:tcPr>
+          <w:p>
+            <w:r>
+              <w:rPr>
+                <w:b/>
+                <w:color w:val="FFFFFF"/>
+                <w:sz w:val="19"/>
+              </w:rPr>
+              <w:t>Requirement</w:t>
+            </w:r>
+          </w:p>
+        </w:tc>
+        <w:tc>
+          <w:tcPr>
+            <w:tcW w:type="dxa" w:w="3106"/>
+            <w:shd w:val="clear" w:fill="4F46E5"/>
+          </w:tcPr>
+          <w:p>
+            <w:r>
+              <w:rPr>
+                <w:b/>
+                <w:color w:val="FFFFFF"/>
+                <w:sz w:val="19"/>
+              </w:rPr>
+              <w:t>Actor</w:t>
+            </w:r>
+          </w:p>
+        </w:tc>
+      </w:tr>
+      <w:tr>
+        <w:tc>
+          <w:tcPr>
+            <w:tcW w:type="dxa" w:w="3106"/>
+          </w:tcPr>
+          <w:p>
+            <w:r>
+              <w:rPr>
+                <w:sz w:val="18"/>
+              </w:rPr>
+              <w:t>FR-26.1</w:t>
+            </w:r>
+          </w:p>
+        </w:tc>
+        <w:tc>
+          <w:tcPr>
+            <w:tcW w:type="dxa" w:w="3106"/>
+          </w:tcPr>
+          <w:p>
+            <w:r>
+              <w:rPr>
+                <w:sz w:val="18"/>
+              </w:rPr>
+              <w:t>SA can enable/disable application modules per company (</w:t>
+            </w:r>
+            <w:r>
+              <w:rPr>
+                <w:rFonts w:ascii="Consolas" w:hAnsi="Consolas"/>
+                <w:color w:val="4F46E5"/>
+                <w:sz w:val="19"/>
+              </w:rPr>
+              <w:t>MyModules</w:t>
+            </w:r>
+            <w:r>
+              <w:rPr>
+                <w:sz w:val="18"/>
+              </w:rPr>
+              <w:t xml:space="preserve">, </w:t>
+            </w:r>
+            <w:r>
+              <w:rPr>
+                <w:rFonts w:ascii="Consolas" w:hAnsi="Consolas"/>
+                <w:color w:val="4F46E5"/>
+                <w:sz w:val="19"/>
+              </w:rPr>
+              <w:t>TechnicalAdminModule</w:t>
+            </w:r>
+            <w:r>
+              <w:rPr>
+                <w:sz w:val="18"/>
+              </w:rPr>
+              <w:t>)</w:t>
+            </w:r>
+          </w:p>
+        </w:tc>
+        <w:tc>
+          <w:tcPr>
+            <w:tcW w:type="dxa" w:w="3106"/>
+          </w:tcPr>
+          <w:p>
+            <w:r>
+              <w:rPr>
+                <w:sz w:val="18"/>
+              </w:rPr>
+              <w:t>SA</w:t>
+            </w:r>
+          </w:p>
+        </w:tc>
+      </w:tr>
+      <w:tr>
+        <w:tc>
+          <w:tcPr>
+            <w:tcW w:type="dxa" w:w="3106"/>
+          </w:tcPr>
+          <w:p>
+            <w:r>
+              <w:rPr>
+                <w:sz w:val="18"/>
+              </w:rPr>
+              <w:t>FR-26.2</w:t>
+            </w:r>
+          </w:p>
+        </w:tc>
+        <w:tc>
+          <w:tcPr>
+            <w:tcW w:type="dxa" w:w="3106"/>
+          </w:tcPr>
+          <w:p>
+            <w:r>
+              <w:rPr>
+                <w:sz w:val="18"/>
+              </w:rPr>
+              <w:t>SA can clear application caches (</w:t>
+            </w:r>
+            <w:r>
+              <w:rPr>
+                <w:rFonts w:ascii="Consolas" w:hAnsi="Consolas"/>
+                <w:color w:val="4F46E5"/>
+                <w:sz w:val="19"/>
+              </w:rPr>
+              <w:t>Cache</w:t>
+            </w:r>
+            <w:r>
+              <w:rPr>
+                <w:sz w:val="18"/>
+              </w:rPr>
+              <w:t xml:space="preserve"> endpoints) for troubleshooting</w:t>
+            </w:r>
+          </w:p>
+        </w:tc>
+        <w:tc>
+          <w:tcPr>
+            <w:tcW w:type="dxa" w:w="3106"/>
+          </w:tcPr>
+          <w:p>
+            <w:r>
+              <w:rPr>
+                <w:sz w:val="18"/>
+              </w:rPr>
+              <w:t>SA</w:t>
+            </w:r>
+          </w:p>
+        </w:tc>
+      </w:tr>
+      <w:tr>
+        <w:tc>
+          <w:tcPr>
+            <w:tcW w:type="dxa" w:w="3106"/>
+          </w:tcPr>
+          <w:p>
+            <w:r>
+              <w:rPr>
+                <w:sz w:val="18"/>
+              </w:rPr>
+              <w:t>FR-26.3</w:t>
+            </w:r>
+          </w:p>
+        </w:tc>
+        <w:tc>
+          <w:tcPr>
+            <w:tcW w:type="dxa" w:w="3106"/>
+          </w:tcPr>
+          <w:p>
+            <w:r>
+              <w:rPr>
+                <w:sz w:val="18"/>
+              </w:rPr>
+              <w:t>Module toggles are persisted and respected by the UI and backend guards</w:t>
+            </w:r>
+          </w:p>
+        </w:tc>
+        <w:tc>
+          <w:tcPr>
+            <w:tcW w:type="dxa" w:w="3106"/>
+          </w:tcPr>
+          <w:p>
+            <w:r>
+              <w:rPr>
+                <w:sz w:val="18"/>
+              </w:rPr>
+              <w:t>SA</w:t>
             </w:r>
           </w:p>
         </w:tc>
@@ -8132,6 +9477,14 @@
         <w:t>7. Requirements Traceability</w:t>
       </w:r>
     </w:p>
+    <w:p>
+      <w:pPr>
+        <w:pStyle w:val="Heading3"/>
+      </w:pPr>
+      <w:r>
+        <w:t>7.1 Module → FR → Controllers</w:t>
+      </w:r>
+    </w:p>
     <w:tbl>
       <w:tblPr>
         <w:tblStyle w:val="TableGrid"/>
@@ -8140,14 +9493,15 @@
         <w:tblLook w:firstColumn="1" w:firstRow="1" w:lastColumn="0" w:lastRow="0" w:noHBand="0" w:noVBand="1" w:val="04A0"/>
       </w:tblPr>
       <w:tblGrid>
-        <w:gridCol w:w="3106"/>
-        <w:gridCol w:w="3106"/>
-        <w:gridCol w:w="3106"/>
+        <w:gridCol w:w="2329"/>
+        <w:gridCol w:w="2329"/>
+        <w:gridCol w:w="2329"/>
+        <w:gridCol w:w="2329"/>
       </w:tblGrid>
       <w:tr>
         <w:tc>
           <w:tcPr>
-            <w:tcW w:type="dxa" w:w="3106"/>
+            <w:tcW w:type="dxa" w:w="2329"/>
             <w:shd w:val="clear" w:fill="4F46E5"/>
           </w:tcPr>
           <w:p>
@@ -8163,7 +9517,7 @@
         </w:tc>
         <w:tc>
           <w:tcPr>
-            <w:tcW w:type="dxa" w:w="3106"/>
+            <w:tcW w:type="dxa" w:w="2329"/>
             <w:shd w:val="clear" w:fill="4F46E5"/>
           </w:tcPr>
           <w:p>
@@ -8179,7 +9533,7 @@
         </w:tc>
         <w:tc>
           <w:tcPr>
-            <w:tcW w:type="dxa" w:w="3106"/>
+            <w:tcW w:type="dxa" w:w="2329"/>
             <w:shd w:val="clear" w:fill="4F46E5"/>
           </w:tcPr>
           <w:p>
@@ -8189,6 +9543,22 @@
                 <w:color w:val="FFFFFF"/>
                 <w:sz w:val="19"/>
               </w:rPr>
+              <w:t>Backend controllers</w:t>
+            </w:r>
+          </w:p>
+        </w:tc>
+        <w:tc>
+          <w:tcPr>
+            <w:tcW w:type="dxa" w:w="2329"/>
+            <w:shd w:val="clear" w:fill="4F46E5"/>
+          </w:tcPr>
+          <w:p>
+            <w:r>
+              <w:rPr>
+                <w:b/>
+                <w:color w:val="FFFFFF"/>
+                <w:sz w:val="19"/>
+              </w:rPr>
               <w:t>Primary roles</w:t>
             </w:r>
           </w:p>
@@ -8197,20 +9567,20 @@
       <w:tr>
         <w:tc>
           <w:tcPr>
-            <w:tcW w:type="dxa" w:w="3106"/>
-          </w:tcPr>
-          <w:p>
-            <w:r>
-              <w:rPr>
-                <w:sz w:val="18"/>
-              </w:rPr>
-              <w:t>Auth</w:t>
-            </w:r>
-          </w:p>
-        </w:tc>
-        <w:tc>
-          <w:tcPr>
-            <w:tcW w:type="dxa" w:w="3106"/>
+            <w:tcW w:type="dxa" w:w="2329"/>
+          </w:tcPr>
+          <w:p>
+            <w:r>
+              <w:rPr>
+                <w:sz w:val="18"/>
+              </w:rPr>
+              <w:t>Auth &amp; Sessions</w:t>
+            </w:r>
+          </w:p>
+        </w:tc>
+        <w:tc>
+          <w:tcPr>
+            <w:tcW w:type="dxa" w:w="2329"/>
           </w:tcPr>
           <w:p>
             <w:r>
@@ -8223,7 +9593,20 @@
         </w:tc>
         <w:tc>
           <w:tcPr>
-            <w:tcW w:type="dxa" w:w="3106"/>
+            <w:tcW w:type="dxa" w:w="2329"/>
+          </w:tcPr>
+          <w:p>
+            <w:r>
+              <w:rPr>
+                <w:sz w:val="18"/>
+              </w:rPr>
+              <w:t>Auth, TechnicalAdminAuth</w:t>
+            </w:r>
+          </w:p>
+        </w:tc>
+        <w:tc>
+          <w:tcPr>
+            <w:tcW w:type="dxa" w:w="2329"/>
           </w:tcPr>
           <w:p>
             <w:r>
@@ -8238,7 +9621,7 @@
       <w:tr>
         <w:tc>
           <w:tcPr>
-            <w:tcW w:type="dxa" w:w="3106"/>
+            <w:tcW w:type="dxa" w:w="2329"/>
           </w:tcPr>
           <w:p>
             <w:r>
@@ -8251,7 +9634,7 @@
         </w:tc>
         <w:tc>
           <w:tcPr>
-            <w:tcW w:type="dxa" w:w="3106"/>
+            <w:tcW w:type="dxa" w:w="2329"/>
           </w:tcPr>
           <w:p>
             <w:r>
@@ -8264,7 +9647,20 @@
         </w:tc>
         <w:tc>
           <w:tcPr>
-            <w:tcW w:type="dxa" w:w="3106"/>
+            <w:tcW w:type="dxa" w:w="2329"/>
+          </w:tcPr>
+          <w:p>
+            <w:r>
+              <w:rPr>
+                <w:sz w:val="18"/>
+              </w:rPr>
+              <w:t>Dashboard</w:t>
+            </w:r>
+          </w:p>
+        </w:tc>
+        <w:tc>
+          <w:tcPr>
+            <w:tcW w:type="dxa" w:w="2329"/>
           </w:tcPr>
           <w:p>
             <w:r>
@@ -8279,20 +9675,20 @@
       <w:tr>
         <w:tc>
           <w:tcPr>
-            <w:tcW w:type="dxa" w:w="3106"/>
-          </w:tcPr>
-          <w:p>
-            <w:r>
-              <w:rPr>
-                <w:sz w:val="18"/>
-              </w:rPr>
-              <w:t>Users/Employees</w:t>
-            </w:r>
-          </w:p>
-        </w:tc>
-        <w:tc>
-          <w:tcPr>
-            <w:tcW w:type="dxa" w:w="3106"/>
+            <w:tcW w:type="dxa" w:w="2329"/>
+          </w:tcPr>
+          <w:p>
+            <w:r>
+              <w:rPr>
+                <w:sz w:val="18"/>
+              </w:rPr>
+              <w:t>Users &amp; Employees</w:t>
+            </w:r>
+          </w:p>
+        </w:tc>
+        <w:tc>
+          <w:tcPr>
+            <w:tcW w:type="dxa" w:w="2329"/>
           </w:tcPr>
           <w:p>
             <w:r>
@@ -8305,7 +9701,20 @@
         </w:tc>
         <w:tc>
           <w:tcPr>
-            <w:tcW w:type="dxa" w:w="3106"/>
+            <w:tcW w:type="dxa" w:w="2329"/>
+          </w:tcPr>
+          <w:p>
+            <w:r>
+              <w:rPr>
+                <w:sz w:val="18"/>
+              </w:rPr>
+              <w:t>User</w:t>
+            </w:r>
+          </w:p>
+        </w:tc>
+        <w:tc>
+          <w:tcPr>
+            <w:tcW w:type="dxa" w:w="2329"/>
           </w:tcPr>
           <w:p>
             <w:r>
@@ -8320,7 +9729,7 @@
       <w:tr>
         <w:tc>
           <w:tcPr>
-            <w:tcW w:type="dxa" w:w="3106"/>
+            <w:tcW w:type="dxa" w:w="2329"/>
           </w:tcPr>
           <w:p>
             <w:r>
@@ -8333,7 +9742,7 @@
         </w:tc>
         <w:tc>
           <w:tcPr>
-            <w:tcW w:type="dxa" w:w="3106"/>
+            <w:tcW w:type="dxa" w:w="2329"/>
           </w:tcPr>
           <w:p>
             <w:r>
@@ -8346,7 +9755,20 @@
         </w:tc>
         <w:tc>
           <w:tcPr>
-            <w:tcW w:type="dxa" w:w="3106"/>
+            <w:tcW w:type="dxa" w:w="2329"/>
+          </w:tcPr>
+          <w:p>
+            <w:r>
+              <w:rPr>
+                <w:sz w:val="18"/>
+              </w:rPr>
+              <w:t>Leave</w:t>
+            </w:r>
+          </w:p>
+        </w:tc>
+        <w:tc>
+          <w:tcPr>
+            <w:tcW w:type="dxa" w:w="2329"/>
           </w:tcPr>
           <w:p>
             <w:r>
@@ -8361,7 +9783,7 @@
       <w:tr>
         <w:tc>
           <w:tcPr>
-            <w:tcW w:type="dxa" w:w="3106"/>
+            <w:tcW w:type="dxa" w:w="2329"/>
           </w:tcPr>
           <w:p>
             <w:r>
@@ -8374,7 +9796,7 @@
         </w:tc>
         <w:tc>
           <w:tcPr>
-            <w:tcW w:type="dxa" w:w="3106"/>
+            <w:tcW w:type="dxa" w:w="2329"/>
           </w:tcPr>
           <w:p>
             <w:r>
@@ -8387,7 +9809,20 @@
         </w:tc>
         <w:tc>
           <w:tcPr>
-            <w:tcW w:type="dxa" w:w="3106"/>
+            <w:tcW w:type="dxa" w:w="2329"/>
+          </w:tcPr>
+          <w:p>
+            <w:r>
+              <w:rPr>
+                <w:sz w:val="18"/>
+              </w:rPr>
+              <w:t>Attendance</w:t>
+            </w:r>
+          </w:p>
+        </w:tc>
+        <w:tc>
+          <w:tcPr>
+            <w:tcW w:type="dxa" w:w="2329"/>
           </w:tcPr>
           <w:p>
             <w:r>
@@ -8402,7 +9837,33 @@
       <w:tr>
         <w:tc>
           <w:tcPr>
-            <w:tcW w:type="dxa" w:w="3106"/>
+            <w:tcW w:type="dxa" w:w="2329"/>
+          </w:tcPr>
+          <w:p>
+            <w:r>
+              <w:rPr>
+                <w:sz w:val="18"/>
+              </w:rPr>
+              <w:t>Payroll &amp; Payslips</w:t>
+            </w:r>
+          </w:p>
+        </w:tc>
+        <w:tc>
+          <w:tcPr>
+            <w:tcW w:type="dxa" w:w="2329"/>
+          </w:tcPr>
+          <w:p>
+            <w:r>
+              <w:rPr>
+                <w:sz w:val="18"/>
+              </w:rPr>
+              <w:t>FR-06</w:t>
+            </w:r>
+          </w:p>
+        </w:tc>
+        <w:tc>
+          <w:tcPr>
+            <w:tcW w:type="dxa" w:w="2329"/>
           </w:tcPr>
           <w:p>
             <w:r>
@@ -8415,20 +9876,7 @@
         </w:tc>
         <w:tc>
           <w:tcPr>
-            <w:tcW w:type="dxa" w:w="3106"/>
-          </w:tcPr>
-          <w:p>
-            <w:r>
-              <w:rPr>
-                <w:sz w:val="18"/>
-              </w:rPr>
-              <w:t>FR-06</w:t>
-            </w:r>
-          </w:p>
-        </w:tc>
-        <w:tc>
-          <w:tcPr>
-            <w:tcW w:type="dxa" w:w="3106"/>
+            <w:tcW w:type="dxa" w:w="2329"/>
           </w:tcPr>
           <w:p>
             <w:r>
@@ -8443,7 +9891,7 @@
       <w:tr>
         <w:tc>
           <w:tcPr>
-            <w:tcW w:type="dxa" w:w="3106"/>
+            <w:tcW w:type="dxa" w:w="2329"/>
           </w:tcPr>
           <w:p>
             <w:r>
@@ -8456,7 +9904,7 @@
         </w:tc>
         <w:tc>
           <w:tcPr>
-            <w:tcW w:type="dxa" w:w="3106"/>
+            <w:tcW w:type="dxa" w:w="2329"/>
           </w:tcPr>
           <w:p>
             <w:r>
@@ -8469,7 +9917,20 @@
         </w:tc>
         <w:tc>
           <w:tcPr>
-            <w:tcW w:type="dxa" w:w="3106"/>
+            <w:tcW w:type="dxa" w:w="2329"/>
+          </w:tcPr>
+          <w:p>
+            <w:r>
+              <w:rPr>
+                <w:sz w:val="18"/>
+              </w:rPr>
+              <w:t>Asset</w:t>
+            </w:r>
+          </w:p>
+        </w:tc>
+        <w:tc>
+          <w:tcPr>
+            <w:tcW w:type="dxa" w:w="2329"/>
           </w:tcPr>
           <w:p>
             <w:r>
@@ -8484,20 +9945,20 @@
       <w:tr>
         <w:tc>
           <w:tcPr>
-            <w:tcW w:type="dxa" w:w="3106"/>
-          </w:tcPr>
-          <w:p>
-            <w:r>
-              <w:rPr>
-                <w:sz w:val="18"/>
-              </w:rPr>
-              <w:t>Claims</w:t>
-            </w:r>
-          </w:p>
-        </w:tc>
-        <w:tc>
-          <w:tcPr>
-            <w:tcW w:type="dxa" w:w="3106"/>
+            <w:tcW w:type="dxa" w:w="2329"/>
+          </w:tcPr>
+          <w:p>
+            <w:r>
+              <w:rPr>
+                <w:sz w:val="18"/>
+              </w:rPr>
+              <w:t>Claims &amp; Expenses</w:t>
+            </w:r>
+          </w:p>
+        </w:tc>
+        <w:tc>
+          <w:tcPr>
+            <w:tcW w:type="dxa" w:w="2329"/>
           </w:tcPr>
           <w:p>
             <w:r>
@@ -8510,7 +9971,20 @@
         </w:tc>
         <w:tc>
           <w:tcPr>
-            <w:tcW w:type="dxa" w:w="3106"/>
+            <w:tcW w:type="dxa" w:w="2329"/>
+          </w:tcPr>
+          <w:p>
+            <w:r>
+              <w:rPr>
+                <w:sz w:val="18"/>
+              </w:rPr>
+              <w:t>TaExpense</w:t>
+            </w:r>
+          </w:p>
+        </w:tc>
+        <w:tc>
+          <w:tcPr>
+            <w:tcW w:type="dxa" w:w="2329"/>
           </w:tcPr>
           <w:p>
             <w:r>
@@ -8525,7 +9999,7 @@
       <w:tr>
         <w:tc>
           <w:tcPr>
-            <w:tcW w:type="dxa" w:w="3106"/>
+            <w:tcW w:type="dxa" w:w="2329"/>
           </w:tcPr>
           <w:p>
             <w:r>
@@ -8538,7 +10012,7 @@
         </w:tc>
         <w:tc>
           <w:tcPr>
-            <w:tcW w:type="dxa" w:w="3106"/>
+            <w:tcW w:type="dxa" w:w="2329"/>
           </w:tcPr>
           <w:p>
             <w:r>
@@ -8551,7 +10025,20 @@
         </w:tc>
         <w:tc>
           <w:tcPr>
-            <w:tcW w:type="dxa" w:w="3106"/>
+            <w:tcW w:type="dxa" w:w="2329"/>
+          </w:tcPr>
+          <w:p>
+            <w:r>
+              <w:rPr>
+                <w:sz w:val="18"/>
+              </w:rPr>
+              <w:t>Complaint</w:t>
+            </w:r>
+          </w:p>
+        </w:tc>
+        <w:tc>
+          <w:tcPr>
+            <w:tcW w:type="dxa" w:w="2329"/>
           </w:tcPr>
           <w:p>
             <w:r>
@@ -8566,7 +10053,7 @@
       <w:tr>
         <w:tc>
           <w:tcPr>
-            <w:tcW w:type="dxa" w:w="3106"/>
+            <w:tcW w:type="dxa" w:w="2329"/>
           </w:tcPr>
           <w:p>
             <w:r>
@@ -8579,7 +10066,7 @@
         </w:tc>
         <w:tc>
           <w:tcPr>
-            <w:tcW w:type="dxa" w:w="3106"/>
+            <w:tcW w:type="dxa" w:w="2329"/>
           </w:tcPr>
           <w:p>
             <w:r>
@@ -8592,7 +10079,20 @@
         </w:tc>
         <w:tc>
           <w:tcPr>
-            <w:tcW w:type="dxa" w:w="3106"/>
+            <w:tcW w:type="dxa" w:w="2329"/>
+          </w:tcPr>
+          <w:p>
+            <w:r>
+              <w:rPr>
+                <w:sz w:val="18"/>
+              </w:rPr>
+              <w:t>Helpdesk</w:t>
+            </w:r>
+          </w:p>
+        </w:tc>
+        <w:tc>
+          <w:tcPr>
+            <w:tcW w:type="dxa" w:w="2329"/>
           </w:tcPr>
           <w:p>
             <w:r>
@@ -8607,7 +10107,7 @@
       <w:tr>
         <w:tc>
           <w:tcPr>
-            <w:tcW w:type="dxa" w:w="3106"/>
+            <w:tcW w:type="dxa" w:w="2329"/>
           </w:tcPr>
           <w:p>
             <w:r>
@@ -8620,7 +10120,7 @@
         </w:tc>
         <w:tc>
           <w:tcPr>
-            <w:tcW w:type="dxa" w:w="3106"/>
+            <w:tcW w:type="dxa" w:w="2329"/>
           </w:tcPr>
           <w:p>
             <w:r>
@@ -8633,7 +10133,20 @@
         </w:tc>
         <w:tc>
           <w:tcPr>
-            <w:tcW w:type="dxa" w:w="3106"/>
+            <w:tcW w:type="dxa" w:w="2329"/>
+          </w:tcPr>
+          <w:p>
+            <w:r>
+              <w:rPr>
+                <w:sz w:val="18"/>
+              </w:rPr>
+              <w:t>SafetyIncident</w:t>
+            </w:r>
+          </w:p>
+        </w:tc>
+        <w:tc>
+          <w:tcPr>
+            <w:tcW w:type="dxa" w:w="2329"/>
           </w:tcPr>
           <w:p>
             <w:r>
@@ -8648,20 +10161,20 @@
       <w:tr>
         <w:tc>
           <w:tcPr>
-            <w:tcW w:type="dxa" w:w="3106"/>
-          </w:tcPr>
-          <w:p>
-            <w:r>
-              <w:rPr>
-                <w:sz w:val="18"/>
-              </w:rPr>
-              <w:t>Chat/Notifications</w:t>
-            </w:r>
-          </w:p>
-        </w:tc>
-        <w:tc>
-          <w:tcPr>
-            <w:tcW w:type="dxa" w:w="3106"/>
+            <w:tcW w:type="dxa" w:w="2329"/>
+          </w:tcPr>
+          <w:p>
+            <w:r>
+              <w:rPr>
+                <w:sz w:val="18"/>
+              </w:rPr>
+              <w:t>Chat &amp; Notifications</w:t>
+            </w:r>
+          </w:p>
+        </w:tc>
+        <w:tc>
+          <w:tcPr>
+            <w:tcW w:type="dxa" w:w="2329"/>
           </w:tcPr>
           <w:p>
             <w:r>
@@ -8674,7 +10187,20 @@
         </w:tc>
         <w:tc>
           <w:tcPr>
-            <w:tcW w:type="dxa" w:w="3106"/>
+            <w:tcW w:type="dxa" w:w="2329"/>
+          </w:tcPr>
+          <w:p>
+            <w:r>
+              <w:rPr>
+                <w:sz w:val="18"/>
+              </w:rPr>
+              <w:t>Notification</w:t>
+            </w:r>
+          </w:p>
+        </w:tc>
+        <w:tc>
+          <w:tcPr>
+            <w:tcW w:type="dxa" w:w="2329"/>
           </w:tcPr>
           <w:p>
             <w:r>
@@ -8689,20 +10215,20 @@
       <w:tr>
         <w:tc>
           <w:tcPr>
-            <w:tcW w:type="dxa" w:w="3106"/>
-          </w:tcPr>
-          <w:p>
-            <w:r>
-              <w:rPr>
-                <w:sz w:val="18"/>
-              </w:rPr>
-              <w:t>Calendar/Onboarding</w:t>
-            </w:r>
-          </w:p>
-        </w:tc>
-        <w:tc>
-          <w:tcPr>
-            <w:tcW w:type="dxa" w:w="3106"/>
+            <w:tcW w:type="dxa" w:w="2329"/>
+          </w:tcPr>
+          <w:p>
+            <w:r>
+              <w:rPr>
+                <w:sz w:val="18"/>
+              </w:rPr>
+              <w:t>Calendar &amp; Onboarding</w:t>
+            </w:r>
+          </w:p>
+        </w:tc>
+        <w:tc>
+          <w:tcPr>
+            <w:tcW w:type="dxa" w:w="2329"/>
           </w:tcPr>
           <w:p>
             <w:r>
@@ -8715,7 +10241,20 @@
         </w:tc>
         <w:tc>
           <w:tcPr>
-            <w:tcW w:type="dxa" w:w="3106"/>
+            <w:tcW w:type="dxa" w:w="2329"/>
+          </w:tcPr>
+          <w:p>
+            <w:r>
+              <w:rPr>
+                <w:sz w:val="18"/>
+              </w:rPr>
+              <w:t>Calendar, Onboarding</w:t>
+            </w:r>
+          </w:p>
+        </w:tc>
+        <w:tc>
+          <w:tcPr>
+            <w:tcW w:type="dxa" w:w="2329"/>
           </w:tcPr>
           <w:p>
             <w:r>
@@ -8730,20 +10269,20 @@
       <w:tr>
         <w:tc>
           <w:tcPr>
-            <w:tcW w:type="dxa" w:w="3106"/>
-          </w:tcPr>
-          <w:p>
-            <w:r>
-              <w:rPr>
-                <w:sz w:val="18"/>
-              </w:rPr>
-              <w:t>Reports</w:t>
-            </w:r>
-          </w:p>
-        </w:tc>
-        <w:tc>
-          <w:tcPr>
-            <w:tcW w:type="dxa" w:w="3106"/>
+            <w:tcW w:type="dxa" w:w="2329"/>
+          </w:tcPr>
+          <w:p>
+            <w:r>
+              <w:rPr>
+                <w:sz w:val="18"/>
+              </w:rPr>
+              <w:t>Reports &amp; Exports</w:t>
+            </w:r>
+          </w:p>
+        </w:tc>
+        <w:tc>
+          <w:tcPr>
+            <w:tcW w:type="dxa" w:w="2329"/>
           </w:tcPr>
           <w:p>
             <w:r>
@@ -8756,7 +10295,20 @@
         </w:tc>
         <w:tc>
           <w:tcPr>
-            <w:tcW w:type="dxa" w:w="3106"/>
+            <w:tcW w:type="dxa" w:w="2329"/>
+          </w:tcPr>
+          <w:p>
+            <w:r>
+              <w:rPr>
+                <w:sz w:val="18"/>
+              </w:rPr>
+              <w:t>Report</w:t>
+            </w:r>
+          </w:p>
+        </w:tc>
+        <w:tc>
+          <w:tcPr>
+            <w:tcW w:type="dxa" w:w="2329"/>
           </w:tcPr>
           <w:p>
             <w:r>
@@ -8771,20 +10323,20 @@
       <w:tr>
         <w:tc>
           <w:tcPr>
-            <w:tcW w:type="dxa" w:w="3106"/>
-          </w:tcPr>
-          <w:p>
-            <w:r>
-              <w:rPr>
-                <w:sz w:val="18"/>
-              </w:rPr>
-              <w:t>Audit</w:t>
-            </w:r>
-          </w:p>
-        </w:tc>
-        <w:tc>
-          <w:tcPr>
-            <w:tcW w:type="dxa" w:w="3106"/>
+            <w:tcW w:type="dxa" w:w="2329"/>
+          </w:tcPr>
+          <w:p>
+            <w:r>
+              <w:rPr>
+                <w:sz w:val="18"/>
+              </w:rPr>
+              <w:t>Audit Log</w:t>
+            </w:r>
+          </w:p>
+        </w:tc>
+        <w:tc>
+          <w:tcPr>
+            <w:tcW w:type="dxa" w:w="2329"/>
           </w:tcPr>
           <w:p>
             <w:r>
@@ -8797,7 +10349,20 @@
         </w:tc>
         <w:tc>
           <w:tcPr>
-            <w:tcW w:type="dxa" w:w="3106"/>
+            <w:tcW w:type="dxa" w:w="2329"/>
+          </w:tcPr>
+          <w:p>
+            <w:r>
+              <w:rPr>
+                <w:sz w:val="18"/>
+              </w:rPr>
+              <w:t>Audit, TechnicalAdminAudit</w:t>
+            </w:r>
+          </w:p>
+        </w:tc>
+        <w:tc>
+          <w:tcPr>
+            <w:tcW w:type="dxa" w:w="2329"/>
           </w:tcPr>
           <w:p>
             <w:r>
@@ -8812,20 +10377,20 @@
       <w:tr>
         <w:tc>
           <w:tcPr>
-            <w:tcW w:type="dxa" w:w="3106"/>
-          </w:tcPr>
-          <w:p>
-            <w:r>
-              <w:rPr>
-                <w:sz w:val="18"/>
-              </w:rPr>
-              <w:t>Roles/Permissions</w:t>
-            </w:r>
-          </w:p>
-        </w:tc>
-        <w:tc>
-          <w:tcPr>
-            <w:tcW w:type="dxa" w:w="3106"/>
+            <w:tcW w:type="dxa" w:w="2329"/>
+          </w:tcPr>
+          <w:p>
+            <w:r>
+              <w:rPr>
+                <w:sz w:val="18"/>
+              </w:rPr>
+              <w:t>Roles &amp; Permissions</w:t>
+            </w:r>
+          </w:p>
+        </w:tc>
+        <w:tc>
+          <w:tcPr>
+            <w:tcW w:type="dxa" w:w="2329"/>
           </w:tcPr>
           <w:p>
             <w:r>
@@ -8838,7 +10403,20 @@
         </w:tc>
         <w:tc>
           <w:tcPr>
-            <w:tcW w:type="dxa" w:w="3106"/>
+            <w:tcW w:type="dxa" w:w="2329"/>
+          </w:tcPr>
+          <w:p>
+            <w:r>
+              <w:rPr>
+                <w:sz w:val="18"/>
+              </w:rPr>
+              <w:t>Permission, TechnicalAdminRole</w:t>
+            </w:r>
+          </w:p>
+        </w:tc>
+        <w:tc>
+          <w:tcPr>
+            <w:tcW w:type="dxa" w:w="2329"/>
           </w:tcPr>
           <w:p>
             <w:r>
@@ -8853,20 +10431,20 @@
       <w:tr>
         <w:tc>
           <w:tcPr>
-            <w:tcW w:type="dxa" w:w="3106"/>
-          </w:tcPr>
-          <w:p>
-            <w:r>
-              <w:rPr>
-                <w:sz w:val="18"/>
-              </w:rPr>
-              <w:t>Settings/Branding</w:t>
-            </w:r>
-          </w:p>
-        </w:tc>
-        <w:tc>
-          <w:tcPr>
-            <w:tcW w:type="dxa" w:w="3106"/>
+            <w:tcW w:type="dxa" w:w="2329"/>
+          </w:tcPr>
+          <w:p>
+            <w:r>
+              <w:rPr>
+                <w:sz w:val="18"/>
+              </w:rPr>
+              <w:t>Settings &amp; Branding</w:t>
+            </w:r>
+          </w:p>
+        </w:tc>
+        <w:tc>
+          <w:tcPr>
+            <w:tcW w:type="dxa" w:w="2329"/>
           </w:tcPr>
           <w:p>
             <w:r>
@@ -8879,7 +10457,20 @@
         </w:tc>
         <w:tc>
           <w:tcPr>
-            <w:tcW w:type="dxa" w:w="3106"/>
+            <w:tcW w:type="dxa" w:w="2329"/>
+          </w:tcPr>
+          <w:p>
+            <w:r>
+              <w:rPr>
+                <w:sz w:val="18"/>
+              </w:rPr>
+              <w:t>Org, Settings</w:t>
+            </w:r>
+          </w:p>
+        </w:tc>
+        <w:tc>
+          <w:tcPr>
+            <w:tcW w:type="dxa" w:w="2329"/>
           </w:tcPr>
           <w:p>
             <w:r>
@@ -8894,20 +10485,20 @@
       <w:tr>
         <w:tc>
           <w:tcPr>
-            <w:tcW w:type="dxa" w:w="3106"/>
-          </w:tcPr>
-          <w:p>
-            <w:r>
-              <w:rPr>
-                <w:sz w:val="18"/>
-              </w:rPr>
-              <w:t>Tenancy</w:t>
-            </w:r>
-          </w:p>
-        </w:tc>
-        <w:tc>
-          <w:tcPr>
-            <w:tcW w:type="dxa" w:w="3106"/>
+            <w:tcW w:type="dxa" w:w="2329"/>
+          </w:tcPr>
+          <w:p>
+            <w:r>
+              <w:rPr>
+                <w:sz w:val="18"/>
+              </w:rPr>
+              <w:t>Multi-Tenancy</w:t>
+            </w:r>
+          </w:p>
+        </w:tc>
+        <w:tc>
+          <w:tcPr>
+            <w:tcW w:type="dxa" w:w="2329"/>
           </w:tcPr>
           <w:p>
             <w:r>
@@ -8920,7 +10511,20 @@
         </w:tc>
         <w:tc>
           <w:tcPr>
-            <w:tcW w:type="dxa" w:w="3106"/>
+            <w:tcW w:type="dxa" w:w="2329"/>
+          </w:tcPr>
+          <w:p>
+            <w:r>
+              <w:rPr>
+                <w:sz w:val="18"/>
+              </w:rPr>
+              <w:t>TechnicalAdminCompany</w:t>
+            </w:r>
+          </w:p>
+        </w:tc>
+        <w:tc>
+          <w:tcPr>
+            <w:tcW w:type="dxa" w:w="2329"/>
           </w:tcPr>
           <w:p>
             <w:r>
@@ -8935,7 +10539,7 @@
       <w:tr>
         <w:tc>
           <w:tcPr>
-            <w:tcW w:type="dxa" w:w="3106"/>
+            <w:tcW w:type="dxa" w:w="2329"/>
           </w:tcPr>
           <w:p>
             <w:r>
@@ -8948,7 +10552,7 @@
         </w:tc>
         <w:tc>
           <w:tcPr>
-            <w:tcW w:type="dxa" w:w="3106"/>
+            <w:tcW w:type="dxa" w:w="2329"/>
           </w:tcPr>
           <w:p>
             <w:r>
@@ -8961,7 +10565,20 @@
         </w:tc>
         <w:tc>
           <w:tcPr>
-            <w:tcW w:type="dxa" w:w="3106"/>
+            <w:tcW w:type="dxa" w:w="2329"/>
+          </w:tcPr>
+          <w:p>
+            <w:r>
+              <w:rPr>
+                <w:sz w:val="18"/>
+              </w:rPr>
+              <w:t>DataReset</w:t>
+            </w:r>
+          </w:p>
+        </w:tc>
+        <w:tc>
+          <w:tcPr>
+            <w:tcW w:type="dxa" w:w="2329"/>
           </w:tcPr>
           <w:p>
             <w:r>
@@ -8976,20 +10593,20 @@
       <w:tr>
         <w:tc>
           <w:tcPr>
-            <w:tcW w:type="dxa" w:w="3106"/>
-          </w:tcPr>
-          <w:p>
-            <w:r>
-              <w:rPr>
-                <w:sz w:val="18"/>
-              </w:rPr>
-              <w:t>Files</w:t>
-            </w:r>
-          </w:p>
-        </w:tc>
-        <w:tc>
-          <w:tcPr>
-            <w:tcW w:type="dxa" w:w="3106"/>
+            <w:tcW w:type="dxa" w:w="2329"/>
+          </w:tcPr>
+          <w:p>
+            <w:r>
+              <w:rPr>
+                <w:sz w:val="18"/>
+              </w:rPr>
+              <w:t>Files &amp; Storage</w:t>
+            </w:r>
+          </w:p>
+        </w:tc>
+        <w:tc>
+          <w:tcPr>
+            <w:tcW w:type="dxa" w:w="2329"/>
           </w:tcPr>
           <w:p>
             <w:r>
@@ -9002,7 +10619,20 @@
         </w:tc>
         <w:tc>
           <w:tcPr>
-            <w:tcW w:type="dxa" w:w="3106"/>
+            <w:tcW w:type="dxa" w:w="2329"/>
+          </w:tcPr>
+          <w:p>
+            <w:r>
+              <w:rPr>
+                <w:sz w:val="18"/>
+              </w:rPr>
+              <w:t>File</w:t>
+            </w:r>
+          </w:p>
+        </w:tc>
+        <w:tc>
+          <w:tcPr>
+            <w:tcW w:type="dxa" w:w="2329"/>
           </w:tcPr>
           <w:p>
             <w:r>
@@ -9010,6 +10640,524 @@
                 <w:sz w:val="18"/>
               </w:rPr>
               <w:t>All</w:t>
+            </w:r>
+          </w:p>
+        </w:tc>
+      </w:tr>
+      <w:tr>
+        <w:tc>
+          <w:tcPr>
+            <w:tcW w:type="dxa" w:w="2329"/>
+          </w:tcPr>
+          <w:p>
+            <w:r>
+              <w:rPr>
+                <w:sz w:val="18"/>
+              </w:rPr>
+              <w:t>AI Chatbot</w:t>
+            </w:r>
+          </w:p>
+        </w:tc>
+        <w:tc>
+          <w:tcPr>
+            <w:tcW w:type="dxa" w:w="2329"/>
+          </w:tcPr>
+          <w:p>
+            <w:r>
+              <w:rPr>
+                <w:sz w:val="18"/>
+              </w:rPr>
+              <w:t>FR-21</w:t>
+            </w:r>
+          </w:p>
+        </w:tc>
+        <w:tc>
+          <w:tcPr>
+            <w:tcW w:type="dxa" w:w="2329"/>
+          </w:tcPr>
+          <w:p>
+            <w:r>
+              <w:rPr>
+                <w:sz w:val="18"/>
+              </w:rPr>
+              <w:t>Chatbot</w:t>
+            </w:r>
+          </w:p>
+        </w:tc>
+        <w:tc>
+          <w:tcPr>
+            <w:tcW w:type="dxa" w:w="2329"/>
+          </w:tcPr>
+          <w:p>
+            <w:r>
+              <w:rPr>
+                <w:sz w:val="18"/>
+              </w:rPr>
+              <w:t>All</w:t>
+            </w:r>
+          </w:p>
+        </w:tc>
+      </w:tr>
+      <w:tr>
+        <w:tc>
+          <w:tcPr>
+            <w:tcW w:type="dxa" w:w="2329"/>
+          </w:tcPr>
+          <w:p>
+            <w:r>
+              <w:rPr>
+                <w:sz w:val="18"/>
+              </w:rPr>
+              <w:t>Community, Calls &amp; Presence</w:t>
+            </w:r>
+          </w:p>
+        </w:tc>
+        <w:tc>
+          <w:tcPr>
+            <w:tcW w:type="dxa" w:w="2329"/>
+          </w:tcPr>
+          <w:p>
+            <w:r>
+              <w:rPr>
+                <w:sz w:val="18"/>
+              </w:rPr>
+              <w:t>FR-22</w:t>
+            </w:r>
+          </w:p>
+        </w:tc>
+        <w:tc>
+          <w:tcPr>
+            <w:tcW w:type="dxa" w:w="2329"/>
+          </w:tcPr>
+          <w:p>
+            <w:r>
+              <w:rPr>
+                <w:sz w:val="18"/>
+              </w:rPr>
+              <w:t>Community, Call, Presence</w:t>
+            </w:r>
+          </w:p>
+        </w:tc>
+        <w:tc>
+          <w:tcPr>
+            <w:tcW w:type="dxa" w:w="2329"/>
+          </w:tcPr>
+          <w:p>
+            <w:r>
+              <w:rPr>
+                <w:sz w:val="18"/>
+              </w:rPr>
+              <w:t>All</w:t>
+            </w:r>
+          </w:p>
+        </w:tc>
+      </w:tr>
+      <w:tr>
+        <w:tc>
+          <w:tcPr>
+            <w:tcW w:type="dxa" w:w="2329"/>
+          </w:tcPr>
+          <w:p>
+            <w:r>
+              <w:rPr>
+                <w:sz w:val="18"/>
+              </w:rPr>
+              <w:t>Performance</w:t>
+            </w:r>
+          </w:p>
+        </w:tc>
+        <w:tc>
+          <w:tcPr>
+            <w:tcW w:type="dxa" w:w="2329"/>
+          </w:tcPr>
+          <w:p>
+            <w:r>
+              <w:rPr>
+                <w:sz w:val="18"/>
+              </w:rPr>
+              <w:t>FR-23</w:t>
+            </w:r>
+          </w:p>
+        </w:tc>
+        <w:tc>
+          <w:tcPr>
+            <w:tcW w:type="dxa" w:w="2329"/>
+          </w:tcPr>
+          <w:p>
+            <w:r>
+              <w:rPr>
+                <w:sz w:val="18"/>
+              </w:rPr>
+              <w:t>Performance</w:t>
+            </w:r>
+          </w:p>
+        </w:tc>
+        <w:tc>
+          <w:tcPr>
+            <w:tcW w:type="dxa" w:w="2329"/>
+          </w:tcPr>
+          <w:p>
+            <w:r>
+              <w:rPr>
+                <w:sz w:val="18"/>
+              </w:rPr>
+              <w:t>HR, TL, EMP</w:t>
+            </w:r>
+          </w:p>
+        </w:tc>
+      </w:tr>
+      <w:tr>
+        <w:tc>
+          <w:tcPr>
+            <w:tcW w:type="dxa" w:w="2329"/>
+          </w:tcPr>
+          <w:p>
+            <w:r>
+              <w:rPr>
+                <w:sz w:val="18"/>
+              </w:rPr>
+              <w:t>Tasks &amp; Task Chat</w:t>
+            </w:r>
+          </w:p>
+        </w:tc>
+        <w:tc>
+          <w:tcPr>
+            <w:tcW w:type="dxa" w:w="2329"/>
+          </w:tcPr>
+          <w:p>
+            <w:r>
+              <w:rPr>
+                <w:sz w:val="18"/>
+              </w:rPr>
+              <w:t>FR-24</w:t>
+            </w:r>
+          </w:p>
+        </w:tc>
+        <w:tc>
+          <w:tcPr>
+            <w:tcW w:type="dxa" w:w="2329"/>
+          </w:tcPr>
+          <w:p>
+            <w:r>
+              <w:rPr>
+                <w:sz w:val="18"/>
+              </w:rPr>
+              <w:t>Task</w:t>
+            </w:r>
+          </w:p>
+        </w:tc>
+        <w:tc>
+          <w:tcPr>
+            <w:tcW w:type="dxa" w:w="2329"/>
+          </w:tcPr>
+          <w:p>
+            <w:r>
+              <w:rPr>
+                <w:sz w:val="18"/>
+              </w:rPr>
+              <w:t>TL, HR, EMP</w:t>
+            </w:r>
+          </w:p>
+        </w:tc>
+      </w:tr>
+      <w:tr>
+        <w:tc>
+          <w:tcPr>
+            <w:tcW w:type="dxa" w:w="2329"/>
+          </w:tcPr>
+          <w:p>
+            <w:r>
+              <w:rPr>
+                <w:sz w:val="18"/>
+              </w:rPr>
+              <w:t>Work Reports</w:t>
+            </w:r>
+          </w:p>
+        </w:tc>
+        <w:tc>
+          <w:tcPr>
+            <w:tcW w:type="dxa" w:w="2329"/>
+          </w:tcPr>
+          <w:p>
+            <w:r>
+              <w:rPr>
+                <w:sz w:val="18"/>
+              </w:rPr>
+              <w:t>FR-25</w:t>
+            </w:r>
+          </w:p>
+        </w:tc>
+        <w:tc>
+          <w:tcPr>
+            <w:tcW w:type="dxa" w:w="2329"/>
+          </w:tcPr>
+          <w:p>
+            <w:r>
+              <w:rPr>
+                <w:sz w:val="18"/>
+              </w:rPr>
+              <w:t>WorkReport</w:t>
+            </w:r>
+          </w:p>
+        </w:tc>
+        <w:tc>
+          <w:tcPr>
+            <w:tcW w:type="dxa" w:w="2329"/>
+          </w:tcPr>
+          <w:p>
+            <w:r>
+              <w:rPr>
+                <w:sz w:val="18"/>
+              </w:rPr>
+              <w:t>EMP, TL, HR</w:t>
+            </w:r>
+          </w:p>
+        </w:tc>
+      </w:tr>
+      <w:tr>
+        <w:tc>
+          <w:tcPr>
+            <w:tcW w:type="dxa" w:w="2329"/>
+          </w:tcPr>
+          <w:p>
+            <w:r>
+              <w:rPr>
+                <w:sz w:val="18"/>
+              </w:rPr>
+              <w:t>Module Mgmt &amp; Cache</w:t>
+            </w:r>
+          </w:p>
+        </w:tc>
+        <w:tc>
+          <w:tcPr>
+            <w:tcW w:type="dxa" w:w="2329"/>
+          </w:tcPr>
+          <w:p>
+            <w:r>
+              <w:rPr>
+                <w:sz w:val="18"/>
+              </w:rPr>
+              <w:t>FR-26</w:t>
+            </w:r>
+          </w:p>
+        </w:tc>
+        <w:tc>
+          <w:tcPr>
+            <w:tcW w:type="dxa" w:w="2329"/>
+          </w:tcPr>
+          <w:p>
+            <w:r>
+              <w:rPr>
+                <w:sz w:val="18"/>
+              </w:rPr>
+              <w:t>MyModules, TechnicalAdminModule, Cache</w:t>
+            </w:r>
+          </w:p>
+        </w:tc>
+        <w:tc>
+          <w:tcPr>
+            <w:tcW w:type="dxa" w:w="2329"/>
+          </w:tcPr>
+          <w:p>
+            <w:r>
+              <w:rPr>
+                <w:sz w:val="18"/>
+              </w:rPr>
+              <w:t>SA</w:t>
+            </w:r>
+          </w:p>
+        </w:tc>
+      </w:tr>
+    </w:tbl>
+    <w:p>
+      <w:pPr>
+        <w:pStyle w:val="Heading3"/>
+      </w:pPr>
+      <w:r>
+        <w:t>7.2 Role → Modules</w:t>
+      </w:r>
+    </w:p>
+    <w:tbl>
+      <w:tblPr>
+        <w:tblStyle w:val="TableGrid"/>
+        <w:tblW w:type="auto" w:w="0"/>
+        <w:jc w:val="center"/>
+        <w:tblLook w:firstColumn="1" w:firstRow="1" w:lastColumn="0" w:lastRow="0" w:noHBand="0" w:noVBand="1" w:val="04A0"/>
+      </w:tblPr>
+      <w:tblGrid>
+        <w:gridCol w:w="4658"/>
+        <w:gridCol w:w="4658"/>
+      </w:tblGrid>
+      <w:tr>
+        <w:tc>
+          <w:tcPr>
+            <w:tcW w:type="dxa" w:w="4658"/>
+            <w:shd w:val="clear" w:fill="4F46E5"/>
+          </w:tcPr>
+          <w:p>
+            <w:r>
+              <w:rPr>
+                <w:b/>
+                <w:color w:val="FFFFFF"/>
+                <w:sz w:val="19"/>
+              </w:rPr>
+              <w:t>Role</w:t>
+            </w:r>
+          </w:p>
+        </w:tc>
+        <w:tc>
+          <w:tcPr>
+            <w:tcW w:type="dxa" w:w="4658"/>
+            <w:shd w:val="clear" w:fill="4F46E5"/>
+          </w:tcPr>
+          <w:p>
+            <w:r>
+              <w:rPr>
+                <w:b/>
+                <w:color w:val="FFFFFF"/>
+                <w:sz w:val="19"/>
+              </w:rPr>
+              <w:t>Modules accessible</w:t>
+            </w:r>
+          </w:p>
+        </w:tc>
+      </w:tr>
+      <w:tr>
+        <w:tc>
+          <w:tcPr>
+            <w:tcW w:type="dxa" w:w="4658"/>
+          </w:tcPr>
+          <w:p>
+            <w:r>
+              <w:rPr>
+                <w:sz w:val="18"/>
+              </w:rPr>
+              <w:t>SUPER_ADMIN</w:t>
+            </w:r>
+          </w:p>
+        </w:tc>
+        <w:tc>
+          <w:tcPr>
+            <w:tcW w:type="dxa" w:w="4658"/>
+          </w:tcPr>
+          <w:p>
+            <w:r>
+              <w:rPr>
+                <w:sz w:val="18"/>
+              </w:rPr>
+              <w:t>All 26 modules incl. technical admin (FR-18, FR-19, FR-26) + all tenants</w:t>
+            </w:r>
+          </w:p>
+        </w:tc>
+      </w:tr>
+      <w:tr>
+        <w:tc>
+          <w:tcPr>
+            <w:tcW w:type="dxa" w:w="4658"/>
+          </w:tcPr>
+          <w:p>
+            <w:r>
+              <w:rPr>
+                <w:sz w:val="18"/>
+              </w:rPr>
+              <w:t>COMPANY_ADMIN</w:t>
+            </w:r>
+          </w:p>
+        </w:tc>
+        <w:tc>
+          <w:tcPr>
+            <w:tcW w:type="dxa" w:w="4658"/>
+          </w:tcPr>
+          <w:p>
+            <w:r>
+              <w:rPr>
+                <w:sz w:val="18"/>
+              </w:rPr>
+              <w:t>All business modules FR-01–FR-25 for own tenant + roles/permissions (FR-16) + audit (FR-15)</w:t>
+            </w:r>
+          </w:p>
+        </w:tc>
+      </w:tr>
+      <w:tr>
+        <w:tc>
+          <w:tcPr>
+            <w:tcW w:type="dxa" w:w="4658"/>
+          </w:tcPr>
+          <w:p>
+            <w:r>
+              <w:rPr>
+                <w:sz w:val="18"/>
+              </w:rPr>
+              <w:t>HR_MANAGER</w:t>
+            </w:r>
+          </w:p>
+        </w:tc>
+        <w:tc>
+          <w:tcPr>
+            <w:tcW w:type="dxa" w:w="4658"/>
+          </w:tcPr>
+          <w:p>
+            <w:r>
+              <w:rPr>
+                <w:sz w:val="18"/>
+              </w:rPr>
+              <w:t>FR-01–FR-14, FR-17, FR-20–FR-25 (people operations; no technical admin)</w:t>
+            </w:r>
+          </w:p>
+        </w:tc>
+      </w:tr>
+      <w:tr>
+        <w:tc>
+          <w:tcPr>
+            <w:tcW w:type="dxa" w:w="4658"/>
+          </w:tcPr>
+          <w:p>
+            <w:r>
+              <w:rPr>
+                <w:sz w:val="18"/>
+              </w:rPr>
+              <w:t>TEAM_LEAD</w:t>
+            </w:r>
+          </w:p>
+        </w:tc>
+        <w:tc>
+          <w:tcPr>
+            <w:tcW w:type="dxa" w:w="4658"/>
+          </w:tcPr>
+          <w:p>
+            <w:r>
+              <w:rPr>
+                <w:sz w:val="18"/>
+              </w:rPr>
+              <w:t>FR-01–FR-05, FR-07–FR-14, FR-20–FR-25 (team scope, approvals)</w:t>
+            </w:r>
+          </w:p>
+        </w:tc>
+      </w:tr>
+      <w:tr>
+        <w:tc>
+          <w:tcPr>
+            <w:tcW w:type="dxa" w:w="4658"/>
+          </w:tcPr>
+          <w:p>
+            <w:r>
+              <w:rPr>
+                <w:sz w:val="18"/>
+              </w:rPr>
+              <w:t>EMPLOYEE</w:t>
+            </w:r>
+          </w:p>
+        </w:tc>
+        <w:tc>
+          <w:tcPr>
+            <w:tcW w:type="dxa" w:w="4658"/>
+          </w:tcPr>
+          <w:p>
+            <w:r>
+              <w:rPr>
+                <w:sz w:val="18"/>
+              </w:rPr>
+              <w:t>FR-01–FR-05, FR-07–FR-14, FR-20–FR-25 (self-service only)</w:t>
             </w:r>
           </w:p>
         </w:tc>

</xml_diff>